<commit_message>
feat(gemini): own caller security persistence
</commit_message>
<xml_diff>
--- a/Security/IA_RealTime_CenterCall_Guia_Viva_Seguridad.docx
+++ b/Security/IA_RealTime_CenterCall_Guia_Viva_Seguridad.docx
@@ -528,7 +528,7 @@
         <w:pStyle w:val="ListBullet"/>
       </w:pPr>
       <w:r>
-        <w:t>Incidente operativo: la persistencia falló inicialmente por drift del token entre Cloud Run/Fast Worker y Control Plane. Los commits 9eef2567... y 154fdcfd... sincronizaron token/HMAC y añadieron preflight autenticado no persistente.</w:t>
+        <w:t>Incidente operativo histórico: la persistencia falló inicialmente por drift del token entre Cloud Run/Fast Worker y Control Plane. Los commits 9eef2567... y 154fdcfd... corrigieron el baseline desplegado. El corte posterior, aún local y sin deploy, traslada endpoint, adaptador Supabase y Queue/DLQ al Gemini Fast Worker, confirma Queue antes de responder, usa Supabase directo como fallback y elimina del CI Fast toda escritura o preflight contra el Worker histórico.</w:t>
       </w:r>
     </w:p>
     <w:p>
@@ -537,6 +537,14 @@
       </w:pPr>
       <w:r>
         <w:t>E2E A-G: cuatro eventos únicos persistidos en 40-135 ms, ningún TOOL_EXECUTION_FAILED; transferencia contestada y cierre HUMAN_HANDOFF_TERMINAL.</w:t>
+      </w:r>
+    </w:p>
+    <w:p>
+      <w:pPr>
+        <w:pStyle w:val="ListBullet"/>
+      </w:pPr>
+      <w:r>
+        <w:t>Continuidad de identidad: CALLER_SECURITY_HMAC_SECRET debe contener exactamente los bytes de la clave histórica. CI compara su SHA-256 con caller-security-hmac-sha256, una huella capturada independientemente antes de la migración. No se genera una clave nueva ni se reutiliza automáticamente la credencial Supabase, porque cualquiera de esas opciones dividiría el historial de reputación. La persistencia sigue siendo sideband por evento discreto y no añade trabajo al audio por chunk.</w:t>
       </w:r>
     </w:p>
     <w:p>
@@ -4364,7 +4372,7 @@
     </w:p>
     <w:p>
       <w:r>
-        <w:t>La implementación OpenAI contiene controles maduros que sirven como referencia y, en algunos casos, como infraestructura directamente reutilizable. No todo debe portarse literalmente a Gemini Fast.</w:t>
+        <w:t>La implementación OpenAI se conserva temporalmente como referencia histórica y producto legado pendiente de retirada. Gemini no reutiliza su runtime, endpoint, cola, secretos ni lifecycle; los controles transversales se implementan detrás de contratos neutrales y almacenamiento compartido.</w:t>
       </w:r>
     </w:p>
     <w:p>

</xml_diff>

<commit_message>
docs: record Gemini security canary rollout
</commit_message>
<xml_diff>
--- a/Security/IA_RealTime_CenterCall_Guia_Viva_Seguridad.docx
+++ b/Security/IA_RealTime_CenterCall_Guia_Viva_Seguridad.docx
@@ -93,7 +93,7 @@
           </w:tcPr>
           <w:p>
             <w:r>
-              <w:t>0.3 - seguridad semántica y reputación persistente E2E</w:t>
+              <w:t>0.4 - extracción Gemini-native desplegada en canary</w:t>
             </w:r>
           </w:p>
         </w:tc>
@@ -295,7 +295,7 @@
           </w:tcPr>
           <w:p>
             <w:r>
-              <w:t>154fdcfd31af22fde7c270b04074cf6cc3898aee</w:t>
+              <w:t>d7435fd81915c470f74bce81eb87d8ae7bda1c1f</w:t>
             </w:r>
           </w:p>
         </w:tc>
@@ -341,7 +341,7 @@
           </w:tcPr>
           <w:p>
             <w:r>
-              <w:t>Gemini Fast Canary Deploy run 33208639554 - SUCCESS; Cloud Run gemini-media-edge-00201-xav; tráfico productivo sin cambios</w:t>
+              <w:t>Gemini Fast Canary Deploy run 33252047260 - SUCCESS; Gemini Media Edge Canary Deploy run 33252047272 - SUCCESS; Cloud Run gemini-media-edge-00202-coh; tráfico productivo sin cambios</w:t>
             </w:r>
           </w:p>
         </w:tc>
@@ -528,7 +528,7 @@
         <w:pStyle w:val="ListBullet"/>
       </w:pPr>
       <w:r>
-        <w:t>Incidente operativo histórico: la persistencia falló inicialmente por drift del token entre Cloud Run/Fast Worker y Control Plane. Los commits 9eef2567... y 154fdcfd... corrigieron el baseline desplegado. El corte posterior, aún local y sin deploy, traslada endpoint, adaptador Supabase y Queue/DLQ al Gemini Fast Worker, confirma Queue antes de responder, usa Supabase directo como fallback y elimina del CI Fast toda escritura o preflight contra el Worker histórico.</w:t>
+        <w:t>Incidente operativo histórico: la persistencia falló inicialmente por drift del token entre Cloud Run/Fast Worker y Control Plane. Los commits 9eef2567... y 154fdcfd... corrigieron el baseline. El corte Gemini-native quedó desplegado en canary con el SHA d7435fd81915...: el Gemini Fast Worker posee endpoint, adaptador Supabase y Queue/DLQ, confirma Queue antes de responder, usa Supabase directo como fallback y elimina del CI Fast toda escritura o preflight contra el Worker histórico.</w:t>
       </w:r>
     </w:p>
     <w:p>
@@ -544,7 +544,7 @@
         <w:pStyle w:val="ListBullet"/>
       </w:pPr>
       <w:r>
-        <w:t>Continuidad de identidad: CALLER_SECURITY_HMAC_SECRET debe contener exactamente los bytes de la clave histórica. CI compara su SHA-256 con caller-security-hmac-sha256, una huella capturada independientemente antes de la migración. No se genera una clave nueva ni se reutiliza automáticamente la credencial Supabase, porque cualquiera de esas opciones dividiría el historial de reputación. La persistencia sigue siendo sideband por evento discreto y no añade trabajo al audio por chunk.</w:t>
+        <w:t>Continuidad de identidad: CALLER_SECURITY_HMAC_SECRET contiene exactamente los bytes de la clave histórica. CI comparó su SHA-256 con caller-security-hmac-sha256, una huella capturada independientemente antes de la migración. No se generó una clave nueva ni se reutilizó automáticamente la credencial Supabase, evitando dividir el historial de reputación. La persistencia sigue siendo sideband por evento discreto y no añade trabajo al audio por chunk.</w:t>
       </w:r>
     </w:p>
     <w:p>
@@ -1488,7 +1488,7 @@
           </w:tcPr>
           <w:p>
             <w:r>
-              <w:t>154fdcfd31af22fde7c270b04074cf6cc3898aee</w:t>
+              <w:t>d7435fd81915c470f74bce81eb87d8ae7bda1c1f</w:t>
             </w:r>
           </w:p>
         </w:tc>
@@ -1538,7 +1538,7 @@
           </w:tcPr>
           <w:p>
             <w:r>
-              <w:t>PR #94 - Fast semantic incidents -&gt; caller reputation; merge 91b473a475a6fd7c235822c5c930cc0f5eba2002; corrección operativa 154fdcfd...</w:t>
+              <w:t>PR #94 - Fast semantic incidents -&gt; caller reputation; extracción Gemini-native d7435fd81915...</w:t>
             </w:r>
           </w:p>
         </w:tc>
@@ -1645,7 +1645,7 @@
           </w:tcPr>
           <w:p>
             <w:r>
-              <w:t>Gemini Fast Canary Deploy run 33208639554 - SUCCESS para 154fdcfd...</w:t>
+              <w:t>Gemini Fast Canary Deploy run 33252047260 - SUCCESS para d7435fd81915...; revisión gemini-media-edge-00202-coh; Fast Worker 3100c432-69a0-44ea-a59f-fdaaa4458221</w:t>
             </w:r>
           </w:p>
         </w:tc>
@@ -12629,7 +12629,7 @@
           </w:tcPr>
           <w:p>
             <w:r>
-              <w:t>La reputación se entrega fuera del forwarding continuo; un fallo de auditoría no añade trabajo por chunk ni autoriza efectos. Token y HMAC deben permanecer sincronizados por workflow fail-closed.</w:t>
+              <w:t>La reputación se entrega fuera del forwarding continuo. Gemini Fast posee su endpoint, Queue/DLQ y fallback Supabase; el workflow verifica token y continuidad HMAC fail-closed sin depender del Worker histórico.</w:t>
             </w:r>
           </w:p>
         </w:tc>
@@ -12639,7 +12639,7 @@
           </w:tcPr>
           <w:p>
             <w:r>
-              <w:t>IMPLEMENTADA Y VERIFICADA E2E</w:t>
+              <w:t>IMPLEMENTADA, CI VERDE Y VERIFICADA EN CANARY</w:t>
             </w:r>
           </w:p>
         </w:tc>
@@ -14412,6 +14412,48 @@
           <w:p>
             <w:r>
               <w:t>VERIFICADO E2E</w:t>
+            </w:r>
+          </w:p>
+        </w:tc>
+      </w:tr>
+      <w:tr>
+        <w:tc>
+          <w:tcPr>
+            <w:tcW w:type="dxa" w:w="2550"/>
+          </w:tcPr>
+          <w:p>
+            <w:r>
+              <w:t>E-020</w:t>
+            </w:r>
+          </w:p>
+        </w:tc>
+        <w:tc>
+          <w:tcPr>
+            <w:tcW w:type="dxa" w:w="2550"/>
+          </w:tcPr>
+          <w:p>
+            <w:r>
+              <w:t>GitHub Actions + Cloud Run + Cloudflare</w:t>
+            </w:r>
+          </w:p>
+        </w:tc>
+        <w:tc>
+          <w:tcPr>
+            <w:tcW w:type="dxa" w:w="2550"/>
+          </w:tcPr>
+          <w:p>
+            <w:r>
+              <w:t>SHA d7435fd81915...; Fast Canary 33252047260 y Media Canary 33252047272 SUCCESS; revisión gemini-media-edge-00202-coh; Worker 3100c432-69a0-44ea-a59f-fdaaa4458221; Queue, token parity, bootstrap y HMAC verificados</w:t>
+            </w:r>
+          </w:p>
+        </w:tc>
+        <w:tc>
+          <w:tcPr>
+            <w:tcW w:type="dxa" w:w="2550"/>
+          </w:tcPr>
+          <w:p>
+            <w:r>
+              <w:t>VERIFICADO EN CANARY</w:t>
             </w:r>
           </w:p>
         </w:tc>
@@ -14775,6 +14817,38 @@
           <w:p>
             <w:r>
               <w:t>Reconciliación PR #93/#94 y corrección de persistencia; E2E A-G; SEC-P0-01/02/03 cerrados; arquitectura transversal/vertical y contrato obligatorio de tools explicitados.</w:t>
+            </w:r>
+          </w:p>
+        </w:tc>
+      </w:tr>
+      <w:tr>
+        <w:tc>
+          <w:tcPr>
+            <w:tcW w:type="dxa" w:w="3400"/>
+          </w:tcPr>
+          <w:p>
+            <w:r>
+              <w:t>0.4</w:t>
+            </w:r>
+          </w:p>
+        </w:tc>
+        <w:tc>
+          <w:tcPr>
+            <w:tcW w:type="dxa" w:w="3400"/>
+          </w:tcPr>
+          <w:p>
+            <w:r>
+              <w:t>2026-08-29</w:t>
+            </w:r>
+          </w:p>
+        </w:tc>
+        <w:tc>
+          <w:tcPr>
+            <w:tcW w:type="dxa" w:w="3400"/>
+          </w:tcPr>
+          <w:p>
+            <w:r>
+              <w:t>Extracción Gemini-native de caller security desplegada: secretos históricos y huella independiente provisionados, Queue/DLQ propias, corte del Worker histórico, CI verde, canary 33252047260/33252047272 y revisión gemini-media-edge-00202-coh.</w:t>
             </w:r>
           </w:p>
         </w:tc>

</xml_diff>

<commit_message>
fix(security): require Fast tool authorization receipts
</commit_message>
<xml_diff>
--- a/Security/IA_RealTime_CenterCall_Guia_Viva_Seguridad.docx
+++ b/Security/IA_RealTime_CenterCall_Guia_Viva_Seguridad.docx
@@ -5624,8 +5624,9 @@
       </w:r>
     </w:p>
     <w:p>
+      <w:pPr/>
       <w:r>
-        <w:t>PR #91 introdujo un kernel genérico, call-scoped, que intercepta todas las function calls antes de handlers y efectos externos. Cada tool declarada necesita una política local; si falta política, el setup/kernel falla cerrado.</w:t>
+        <w:t>PR #91 introdujo el kernel genérico call-scoped. SEC-P0-04 refuerza ahora la frontera de ejecución: el kernel emite un comprobante opaco ligado a la function call y al contexto autenticado tenant/call, y cada sink de efectos exige ese comprobante antes de alcanzar un handler. Una llamada directa al ejecutor, un objeto de autorización fabricado o su reutilización en otra llamada/contexto falla cerrado.</w:t>
       </w:r>
     </w:p>
     <w:tbl>
@@ -7324,6 +7325,60 @@
     </w:p>
     <w:p>
       <w:pPr>
+        <w:pStyle w:val="Heading2"/>
+      </w:pPr>
+      <w:r>
+        <w:t>6.8 Cobertura universal del Tool Kernel - SEC-P0-04</w:t>
+      </w:r>
+    </w:p>
+    <w:p>
+      <w:pPr/>
+      <w:r>
+        <w:t>Implementado localmente el 29 de agosto de 2026, pendiente de commit, CI y despliegue. La autorización deja de ser una convención de orden en fast-runtime y pasa a ser una precondición técnica de cada sink effectful.</w:t>
+      </w:r>
+    </w:p>
+    <w:p>
+      <w:pPr>
+        <w:pStyle w:val="ListBullet"/>
+      </w:pPr>
+      <w:r>
+        <w:t>FastToolAuthorizationKernel emite un recibo opaco mediante un WeakMap privado; no puede fabricarse copiando los campos públicos de una decisión ALLOW.</w:t>
+      </w:r>
+    </w:p>
+    <w:p>
+      <w:pPr>
+        <w:pStyle w:val="ListBullet"/>
+      </w:pPr>
+      <w:r>
+        <w:t>El recibo queda ligado por identidad a la function call exacta y al tenantId/callControlId autenticado.</w:t>
+      </w:r>
+    </w:p>
+    <w:p>
+      <w:pPr>
+        <w:pStyle w:val="ListBullet"/>
+      </w:pPr>
+      <w:r>
+        <w:t>El ejecutor usa la instantánea de argumentos autorizada; una mutación posterior del payload no altera el efecto ejecutado.</w:t>
+      </w:r>
+    </w:p>
+    <w:p>
+      <w:pPr>
+        <w:pStyle w:val="ListBullet"/>
+      </w:pPr>
+      <w:r>
+        <w:t>El sink especial transfer_call valida el mismo recibo antes de autorizar o iniciar el handoff.</w:t>
+      </w:r>
+    </w:p>
+    <w:p>
+      <w:pPr>
+        <w:pStyle w:val="ListBullet"/>
+      </w:pPr>
+      <w:r>
+        <w:t>Prueba focalizada: 22/22 PASS. Reproducción previa: llamada directa al ejecutor produjo effects=1. Verificación posterior: effects=0 y error Fast tool authorization receipt is required.</w:t>
+      </w:r>
+    </w:p>
+    <w:p>
+      <w:pPr>
         <w:pStyle w:val="Heading1"/>
         <w:keepNext/>
       </w:pPr>
@@ -9900,17 +9955,8 @@
             <w:shd w:fill="F4F7FA"/>
           </w:tcPr>
           <w:p>
-            <w:pPr>
-              <w:spacing w:after="0"/>
-            </w:pPr>
-            <w:r/>
-            <w:r>
-              <w:rPr>
-                <w:rFonts w:ascii="Aptos" w:hAnsi="Aptos"/>
-                <w:b w:val="0"/>
-                <w:sz w:val="14"/>
-              </w:rPr>
-              <w:t>Tests de missing policy, undeclared tool y bypass imposible.</w:t>
+            <w:r>
+              <w:t>IMPLEMENTADO LOCALMENTE: missing policy, undeclared tool, recibo ausente/fabricado, rebinding call/context y mutación post-autorización producen side effect=0. Pendiente de commit, CI/canary y, si procede, verificación E2E.</w:t>
             </w:r>
           </w:p>
         </w:tc>
@@ -12644,6 +12690,58 @@
           </w:p>
         </w:tc>
       </w:tr>
+      <w:tr>
+        <w:tc>
+          <w:tcPr>
+            <w:tcW w:type="dxa" w:w="2040"/>
+          </w:tcPr>
+          <w:p>
+            <w:r>
+              <w:t>D-014</w:t>
+            </w:r>
+          </w:p>
+        </w:tc>
+        <w:tc>
+          <w:tcPr>
+            <w:tcW w:type="dxa" w:w="2040"/>
+          </w:tcPr>
+          <w:p>
+            <w:r>
+              <w:t>2026-08-29</w:t>
+            </w:r>
+          </w:p>
+        </w:tc>
+        <w:tc>
+          <w:tcPr>
+            <w:tcW w:type="dxa" w:w="2040"/>
+          </w:tcPr>
+          <w:p>
+            <w:r>
+              <w:t>Recibo opaco obligatorio en cada sink de tools</w:t>
+            </w:r>
+          </w:p>
+        </w:tc>
+        <w:tc>
+          <w:tcPr>
+            <w:tcW w:type="dxa" w:w="2040"/>
+          </w:tcPr>
+          <w:p>
+            <w:r>
+              <w:t>Una decisión ALLOW sólo habilita el efecto mediante un recibo no fabricable, ligado a la call exacta y al contexto tenant/call. Executor y transfer_call consumen la instantánea autorizada.</w:t>
+            </w:r>
+          </w:p>
+        </w:tc>
+        <w:tc>
+          <w:tcPr>
+            <w:tcW w:type="dxa" w:w="2040"/>
+          </w:tcPr>
+          <w:p>
+            <w:r>
+              <w:t>IMPLEMENTADA LOCALMENTE; PENDIENTE CI/DEPLOY</w:t>
+            </w:r>
+          </w:p>
+        </w:tc>
+      </w:tr>
     </w:tbl>
     <w:p>
       <w:pPr>
@@ -14454,6 +14552,48 @@
           <w:p>
             <w:r>
               <w:t>VERIFICADO EN CANARY</w:t>
+            </w:r>
+          </w:p>
+        </w:tc>
+      </w:tr>
+      <w:tr>
+        <w:tc>
+          <w:tcPr>
+            <w:tcW w:type="dxa" w:w="2550"/>
+          </w:tcPr>
+          <w:p>
+            <w:r>
+              <w:t>E-021</w:t>
+            </w:r>
+          </w:p>
+        </w:tc>
+        <w:tc>
+          <w:tcPr>
+            <w:tcW w:type="dxa" w:w="2550"/>
+          </w:tcPr>
+          <w:p>
+            <w:r>
+              <w:t>Código + tests locales</w:t>
+            </w:r>
+          </w:p>
+        </w:tc>
+        <w:tc>
+          <w:tcPr>
+            <w:tcW w:type="dxa" w:w="2550"/>
+          </w:tcPr>
+          <w:p>
+            <w:r>
+              <w:t>fast-tool-authorization-kernel.mjs, fast-tool-executor.mjs y fast-runtime.mjs; 22/22 tests focalizados PASS; bypass directo cambia de effects=1 a effects=0.</w:t>
+            </w:r>
+          </w:p>
+        </w:tc>
+        <w:tc>
+          <w:tcPr>
+            <w:tcW w:type="dxa" w:w="2550"/>
+          </w:tcPr>
+          <w:p>
+            <w:r>
+              <w:t>VERIFICADO LOCALMENTE</w:t>
             </w:r>
           </w:p>
         </w:tc>
@@ -14853,6 +14993,38 @@
           </w:p>
         </w:tc>
       </w:tr>
+      <w:tr>
+        <w:tc>
+          <w:tcPr>
+            <w:tcW w:type="dxa" w:w="3400"/>
+          </w:tcPr>
+          <w:p>
+            <w:r>
+              <w:t>0.5</w:t>
+            </w:r>
+          </w:p>
+        </w:tc>
+        <w:tc>
+          <w:tcPr>
+            <w:tcW w:type="dxa" w:w="3400"/>
+          </w:tcPr>
+          <w:p>
+            <w:r>
+              <w:t>2026-08-29</w:t>
+            </w:r>
+          </w:p>
+        </w:tc>
+        <w:tc>
+          <w:tcPr>
+            <w:tcW w:type="dxa" w:w="3400"/>
+          </w:tcPr>
+          <w:p>
+            <w:r>
+              <w:t>SEC-P0-04 implementado localmente: recibo opaco de autorización obligatorio en executor y transferencia, binding call/tenant/context, snapshot autorizado de argumentos y pruebas negativas de bypass.</w:t>
+            </w:r>
+          </w:p>
+        </w:tc>
+      </w:tr>
     </w:tbl>
     <w:p>
       <w:pPr>
@@ -14931,9 +15103,9 @@
           </w:tcPr>
           <w:p>
             <w:r>
-              <w:t>Cierre de versión 0.3</w:t>
+              <w:t>Cierre de versión 0.5</w:t>
               <w:br/>
-              <w:t>Esta versión mantiene la seguridad como programa vivo. La frontera semántica y la reputación persistente están verificadas E2E, pero siguen abiertos SEC-P0-04 en adelante, la política de decay/reset de risk_score y la extracción física de caller security neutral fuera del Worker OpenAI antes del aislamiento operativo total.</w:t>
+              <w:t>La frontera semántica y la reputación persistente continúan verificadas E2E. SEC-P0-04 está implementado y verificado localmente, pero no se considera desplegado hasta registrar commit, CI y canary. Permanecen abiertos SEC-P0-05 en adelante y SEC-P1-05.</w:t>
             </w:r>
           </w:p>
         </w:tc>

</xml_diff>

<commit_message>
fix(security): bind Fast tool capabilities to tenant admission
</commit_message>
<xml_diff>
--- a/Security/IA_RealTime_CenterCall_Guia_Viva_Seguridad.docx
+++ b/Security/IA_RealTime_CenterCall_Guia_Viva_Seguridad.docx
@@ -545,6 +545,68 @@
       </w:pPr>
       <w:r>
         <w:t>Continuidad de identidad: CALLER_SECURITY_HMAC_SECRET contiene exactamente los bytes de la clave histórica. CI comparó su SHA-256 con caller-security-hmac-sha256, una huella capturada independientemente antes de la migración. No se generó una clave nueva ni se reutilizó automáticamente la credencial Supabase, evitando dividir el historial de reputación. La persistencia sigue siendo sideband por evento discreto y no añade trabajo al audio por chunk.</w:t>
+      </w:r>
+    </w:p>
+    <w:p>
+      <w:pPr>
+        <w:pStyle w:val="Heading2"/>
+      </w:pPr>
+      <w:r>
+        <w:t>6.9 Aislamiento tenant/capability - SEC-P0-05</w:t>
+      </w:r>
+    </w:p>
+    <w:p>
+      <w:pPr/>
+      <w:r>
+        <w:t>Implementado y verificado localmente el 29 de agosto de 2026, pendiente de commit, CI y despliegue. El bootstrap autenticado evoluciona a gemini-fast-bootstrap.v2 y convierte la capability de cada tool en una concesión explícita, no en metadata implícita por nombre.</w:t>
+      </w:r>
+    </w:p>
+    <w:p>
+      <w:pPr>
+        <w:pStyle w:val="ListBullet"/>
+      </w:pPr>
+      <w:r>
+        <w:t>Control Plane exige nombre y capability válidos, sin duplicados, y conserva ambos en el bootstrap autenticado ligado a credencial, tenant y llamada.</w:t>
+      </w:r>
+    </w:p>
+    <w:p>
+      <w:pPr>
+        <w:pStyle w:val="ListBullet"/>
+      </w:pPr>
+      <w:r>
+        <w:t>Media Edge rechaza bootstrap v1, capability ausente y cualquier diferencia entre la concesión declarada y la policy local antes de construir la sesión o registrar handlers.</w:t>
+      </w:r>
+    </w:p>
+    <w:p>
+      <w:pPr>
+        <w:pStyle w:val="ListBullet"/>
+      </w:pPr>
+      <w:r>
+        <w:t>La capability interna se valida durante bootstrap/setup y se elimina de la declaración enviada al wire de Gemini; no añade RPC, inferencia, persistencia ni trabajo por chunk de audio.</w:t>
+      </w:r>
+    </w:p>
+    <w:p>
+      <w:pPr>
+        <w:pStyle w:val="ListBullet"/>
+      </w:pPr>
+      <w:r>
+        <w:t>El registro de bootstrap consume una sola vez la credencial y rechaza claims de otro tenant/call. El Worker también rechaza tenant_capabilities cuyo tenant declarado no coincide con el tenant resuelto por routing.</w:t>
+      </w:r>
+    </w:p>
+    <w:p>
+      <w:pPr>
+        <w:pStyle w:val="ListBullet"/>
+      </w:pPr>
+      <w:r>
+        <w:t>Reproducción previa: una tool declarada con capability ajena alcanzó el handler (effects=1). Verificación posterior: effects=0 y error Fast tool capability mismatch for declared tool: create_reservation.</w:t>
+      </w:r>
+    </w:p>
+    <w:p>
+      <w:pPr>
+        <w:pStyle w:val="ListBullet"/>
+      </w:pPr>
+      <w:r>
+        <w:t>Validación local: Gemini Media Edge 239/239 tests PASS; Gemini Control Plane 125/125 tests PASS; typecheck PASS; Wrangler dry-run PASS.</w:t>
       </w:r>
     </w:p>
     <w:p>
@@ -7334,7 +7396,7 @@
     <w:p>
       <w:pPr/>
       <w:r>
-        <w:t>Implementado localmente el 29 de agosto de 2026, pendiente de commit, CI y despliegue. La autorización deja de ser una convención de orden en fast-runtime y pasa a ser una precondición técnica de cada sink effectful.</w:t>
+        <w:t>Publicado el 29 de agosto de 2026 en la rama codex/fix-fast-security-persistence mediante el commit 1d514b5617a9f10691359ba6eb2493a478324baf. Pendiente de CI, despliegue y verificación E2E. La autorización deja de ser una convención de orden en fast-runtime y pasa a ser una precondición técnica de cada sink effectful.</w:t>
       </w:r>
     </w:p>
     <w:p>
@@ -9847,16 +9909,7 @@
             <w:shd w:fill="F4F7FA"/>
           </w:tcPr>
           <w:p>
-            <w:pPr>
-              <w:spacing w:after="0"/>
-            </w:pPr>
-            <w:r/>
-            <w:r>
-              <w:rPr>
-                <w:rFonts w:ascii="Aptos" w:hAnsi="Aptos"/>
-                <w:b w:val="0"/>
-                <w:sz w:val="14"/>
-              </w:rPr>
+            <w:r>
               <w:t>SEC-P0-04</w:t>
             </w:r>
           </w:p>
@@ -9874,16 +9927,7 @@
             <w:shd w:fill="F4F7FA"/>
           </w:tcPr>
           <w:p>
-            <w:pPr>
-              <w:spacing w:after="0"/>
-            </w:pPr>
-            <w:r/>
-            <w:r>
-              <w:rPr>
-                <w:rFonts w:ascii="Aptos" w:hAnsi="Aptos"/>
-                <w:b w:val="0"/>
-                <w:sz w:val="14"/>
-              </w:rPr>
+            <w:r>
               <w:t>P0</w:t>
             </w:r>
           </w:p>
@@ -9901,16 +9945,7 @@
             <w:shd w:fill="F4F7FA"/>
           </w:tcPr>
           <w:p>
-            <w:pPr>
-              <w:spacing w:after="0"/>
-            </w:pPr>
-            <w:r/>
-            <w:r>
-              <w:rPr>
-                <w:rFonts w:ascii="Aptos" w:hAnsi="Aptos"/>
-                <w:b w:val="0"/>
-                <w:sz w:val="14"/>
-              </w:rPr>
+            <w:r>
               <w:t>Cobertura universal del Tool Kernel</w:t>
             </w:r>
           </w:p>
@@ -9928,16 +9963,7 @@
             <w:shd w:fill="F4F7FA"/>
           </w:tcPr>
           <w:p>
-            <w:pPr>
-              <w:spacing w:after="0"/>
-            </w:pPr>
-            <w:r/>
-            <w:r>
-              <w:rPr>
-                <w:rFonts w:ascii="Aptos" w:hAnsi="Aptos"/>
-                <w:b w:val="0"/>
-                <w:sz w:val="14"/>
-              </w:rPr>
+            <w:r>
               <w:t>Verificar que toda tool presente/futura tiene policy local y que no existe bypass directo a handlers.</w:t>
             </w:r>
           </w:p>
@@ -9956,7 +9982,7 @@
           </w:tcPr>
           <w:p>
             <w:r>
-              <w:t>IMPLEMENTADO LOCALMENTE: missing policy, undeclared tool, recibo ausente/fabricado, rebinding call/context y mutación post-autorización producen side effect=0. Pendiente de commit, CI/canary y, si procede, verificación E2E.</w:t>
+              <w:t>COMMIT/PUSH 1d514b5617a9f10691359ba6eb2493a478324baf; pruebas locales PASS. Pendiente CI/canary y, si procede, E2E.</w:t>
             </w:r>
           </w:p>
         </w:tc>
@@ -9977,16 +10003,7 @@
             </w:tcMar>
           </w:tcPr>
           <w:p>
-            <w:pPr>
-              <w:spacing w:after="0"/>
-            </w:pPr>
-            <w:r/>
-            <w:r>
-              <w:rPr>
-                <w:rFonts w:ascii="Aptos" w:hAnsi="Aptos"/>
-                <w:b w:val="0"/>
-                <w:sz w:val="14"/>
-              </w:rPr>
+            <w:r>
               <w:t>SEC-P0-05</w:t>
             </w:r>
           </w:p>
@@ -10003,16 +10020,7 @@
             </w:tcMar>
           </w:tcPr>
           <w:p>
-            <w:pPr>
-              <w:spacing w:after="0"/>
-            </w:pPr>
-            <w:r/>
-            <w:r>
-              <w:rPr>
-                <w:rFonts w:ascii="Aptos" w:hAnsi="Aptos"/>
-                <w:b w:val="0"/>
-                <w:sz w:val="14"/>
-              </w:rPr>
+            <w:r>
               <w:t>P0</w:t>
             </w:r>
           </w:p>
@@ -10029,16 +10037,7 @@
             </w:tcMar>
           </w:tcPr>
           <w:p>
-            <w:pPr>
-              <w:spacing w:after="0"/>
-            </w:pPr>
-            <w:r/>
-            <w:r>
-              <w:rPr>
-                <w:rFonts w:ascii="Aptos" w:hAnsi="Aptos"/>
-                <w:b w:val="0"/>
-                <w:sz w:val="14"/>
-              </w:rPr>
+            <w:r>
               <w:t>Tenant/capability isolation</w:t>
             </w:r>
           </w:p>
@@ -10055,17 +10054,8 @@
             </w:tcMar>
           </w:tcPr>
           <w:p>
-            <w:pPr>
-              <w:spacing w:after="0"/>
-            </w:pPr>
-            <w:r/>
-            <w:r>
-              <w:rPr>
-                <w:rFonts w:ascii="Aptos" w:hAnsi="Aptos"/>
-                <w:b w:val="0"/>
-                <w:sz w:val="14"/>
-              </w:rPr>
-              <w:t>Probar intentos cross-tenant y capabilities ausentes.</w:t>
+            <w:r>
+              <w:t>Probar intentos cross-tenant, capability ausente y capability distinta del contrato local.</w:t>
             </w:r>
           </w:p>
         </w:tc>
@@ -10081,17 +10071,8 @@
             </w:tcMar>
           </w:tcPr>
           <w:p>
-            <w:pPr>
-              <w:spacing w:after="0"/>
-            </w:pPr>
-            <w:r/>
-            <w:r>
-              <w:rPr>
-                <w:rFonts w:ascii="Aptos" w:hAnsi="Aptos"/>
-                <w:b w:val="0"/>
-                <w:sz w:val="14"/>
-              </w:rPr>
-              <w:t>Side effect=0 y auditoría segura.</w:t>
+            <w:r>
+              <w:t>IMPLEMENTADO LOCALMENTE: todos los casos fallan antes del handler con side effect=0; suites completas y dry-run PASS. Pendiente commit, CI/canary y, si procede, E2E.</w:t>
             </w:r>
           </w:p>
         </w:tc>
@@ -12742,6 +12723,58 @@
           </w:p>
         </w:tc>
       </w:tr>
+      <w:tr>
+        <w:tc>
+          <w:tcPr>
+            <w:tcW w:type="dxa" w:w="2040"/>
+          </w:tcPr>
+          <w:p>
+            <w:r>
+              <w:t>D-015</w:t>
+            </w:r>
+          </w:p>
+        </w:tc>
+        <w:tc>
+          <w:tcPr>
+            <w:tcW w:type="dxa" w:w="2040"/>
+          </w:tcPr>
+          <w:p>
+            <w:r>
+              <w:t>2026-08-29</w:t>
+            </w:r>
+          </w:p>
+        </w:tc>
+        <w:tc>
+          <w:tcPr>
+            <w:tcW w:type="dxa" w:w="2040"/>
+          </w:tcPr>
+          <w:p>
+            <w:r>
+              <w:t>Capability grant explícito y tenant-bound</w:t>
+            </w:r>
+          </w:p>
+        </w:tc>
+        <w:tc>
+          <w:tcPr>
+            <w:tcW w:type="dxa" w:w="2040"/>
+          </w:tcPr>
+          <w:p>
+            <w:r>
+              <w:t>Cada tool admitida declara capability en bootstrap v2. Media Edge exige coincidencia exacta con la policy local antes de exponerla o ejecutarla; ausencia, mismatch o claims cross-tenant fallan cerrados.</w:t>
+            </w:r>
+          </w:p>
+        </w:tc>
+        <w:tc>
+          <w:tcPr>
+            <w:tcW w:type="dxa" w:w="2040"/>
+          </w:tcPr>
+          <w:p>
+            <w:r>
+              <w:t>IMPLEMENTADA LOCALMENTE; PENDIENTE PUBLICACIÓN/DEPLOY</w:t>
+            </w:r>
+          </w:p>
+        </w:tc>
+      </w:tr>
     </w:tbl>
     <w:p>
       <w:pPr>
@@ -14573,6 +14606,48 @@
           </w:tcPr>
           <w:p>
             <w:r>
+              <w:t>Git + código + tests locales</w:t>
+            </w:r>
+          </w:p>
+        </w:tc>
+        <w:tc>
+          <w:tcPr>
+            <w:tcW w:type="dxa" w:w="2550"/>
+          </w:tcPr>
+          <w:p>
+            <w:r>
+              <w:t>SEC-P0-04 commit/push 1d514b5617a9f10691359ba6eb2493a478324baf; recibo obligatorio en executor y transfer_call; bypass directo effects=0.</w:t>
+            </w:r>
+          </w:p>
+        </w:tc>
+        <w:tc>
+          <w:tcPr>
+            <w:tcW w:type="dxa" w:w="2550"/>
+          </w:tcPr>
+          <w:p>
+            <w:r>
+              <w:t>PUBLICADO; PENDIENTE CI/DEPLOY</w:t>
+            </w:r>
+          </w:p>
+        </w:tc>
+      </w:tr>
+      <w:tr>
+        <w:tc>
+          <w:tcPr>
+            <w:tcW w:type="dxa" w:w="2550"/>
+          </w:tcPr>
+          <w:p>
+            <w:r>
+              <w:t>E-022</w:t>
+            </w:r>
+          </w:p>
+        </w:tc>
+        <w:tc>
+          <w:tcPr>
+            <w:tcW w:type="dxa" w:w="2550"/>
+          </w:tcPr>
+          <w:p>
+            <w:r>
               <w:t>Código + tests locales</w:t>
             </w:r>
           </w:p>
@@ -14583,7 +14658,7 @@
           </w:tcPr>
           <w:p>
             <w:r>
-              <w:t>fast-tool-authorization-kernel.mjs, fast-tool-executor.mjs y fast-runtime.mjs; 22/22 tests focalizados PASS; bypass directo cambia de effects=1 a effects=0.</w:t>
+              <w:t>gemini-fast-bootstrap.v2 y capability explícita; mismatch/ausencia/cross-tenant producen side effect=0. Media Edge 239/239; Control Plane 125/125; typecheck y Wrangler dry-run PASS.</w:t>
             </w:r>
           </w:p>
         </w:tc>
@@ -15025,6 +15100,38 @@
           </w:p>
         </w:tc>
       </w:tr>
+      <w:tr>
+        <w:tc>
+          <w:tcPr>
+            <w:tcW w:type="dxa" w:w="3400"/>
+          </w:tcPr>
+          <w:p>
+            <w:r>
+              <w:t>0.6</w:t>
+            </w:r>
+          </w:p>
+        </w:tc>
+        <w:tc>
+          <w:tcPr>
+            <w:tcW w:type="dxa" w:w="3400"/>
+          </w:tcPr>
+          <w:p>
+            <w:r>
+              <w:t>2026-08-29</w:t>
+            </w:r>
+          </w:p>
+        </w:tc>
+        <w:tc>
+          <w:tcPr>
+            <w:tcW w:type="dxa" w:w="3400"/>
+          </w:tcPr>
+          <w:p>
+            <w:r>
+              <w:t>SEC-P0-04 publicado en 1d514b... y SEC-P0-05 implementado localmente: bootstrap v2, capability grant explícito y tenant-bound, fail-closed ante ausencia/mismatch/cross-tenant y suites completas verdes.</w:t>
+            </w:r>
+          </w:p>
+        </w:tc>
+      </w:tr>
     </w:tbl>
     <w:p>
       <w:pPr>
@@ -15103,9 +15210,9 @@
           </w:tcPr>
           <w:p>
             <w:r>
-              <w:t>Cierre de versión 0.5</w:t>
+              <w:t>Cierre de versión 0.6</w:t>
               <w:br/>
-              <w:t>La frontera semántica y la reputación persistente continúan verificadas E2E. SEC-P0-04 está implementado y verificado localmente, pero no se considera desplegado hasta registrar commit, CI y canary. Permanecen abiertos SEC-P0-05 en adelante y SEC-P1-05.</w:t>
+              <w:t>SEC-P0-04 está publicado, aún sin deploy/E2E. SEC-P0-05 queda implementado y verificado localmente, pero no se considera publicado ni desplegado hasta registrar commit, CI y canary. Permanecen abiertos SEC-P0-06 en adelante y SEC-P1-05.</w:t>
             </w:r>
           </w:p>
         </w:tc>

</xml_diff>

<commit_message>
security(gemini): enforce diagnostic audit allowlist
</commit_message>
<xml_diff>
--- a/Security/IA_RealTime_CenterCall_Guia_Viva_Seguridad.docx
+++ b/Security/IA_RealTime_CenterCall_Guia_Viva_Seguridad.docx
@@ -93,7 +93,7 @@
           </w:tcPr>
           <w:p>
             <w:r>
-              <w:t>0.4 - extracción Gemini-native desplegada en canary</w:t>
+              <w:t>0.7 - SEC-P0-06 implementado localmente</w:t>
             </w:r>
           </w:p>
         </w:tc>
@@ -341,7 +341,7 @@
           </w:tcPr>
           <w:p>
             <w:r>
-              <w:t>Gemini Fast Canary Deploy run 33252047260 - SUCCESS; Gemini Media Edge Canary Deploy run 33252047272 - SUCCESS; Cloud Run gemini-media-edge-00202-coh; tráfico productivo sin cambios</w:t>
+              <w:t>SEC-P0-05: Gemini Fast Canary Deploy run 33261676273 - SUCCESS; Cloud Run gemini-media-edge-00205-mub; Fast Worker 318b36d8-a900-4fe9-99ba-64863891883f. SEC-P0-06 pendiente de commit/CI/deploy; tráfico productivo sin cambios.</w:t>
             </w:r>
           </w:p>
         </w:tc>
@@ -480,137 +480,6 @@
     </w:p>
     <w:p>
       <w:pPr>
-        <w:pStyle w:val="Heading2"/>
-      </w:pPr>
-      <w:r>
-        <w:t>6.7 Seguridad semántica y reputación persistente - PR #93/#94</w:t>
-      </w:r>
-    </w:p>
-    <w:p>
-      <w:r>
-        <w:t>SEC-P0-02 y SEC-P0-03 quedaron implementados, fusionados y verificados E2E. report_semantic_security_incident acepta únicamente categorías cerradas, pasa por FastToolAuthorizationKernel y entrega una señal mínima a CallerSecurityService.</w:t>
-      </w:r>
-    </w:p>
-    <w:p>
-      <w:pPr>
-        <w:pStyle w:val="ListBullet"/>
-      </w:pPr>
-      <w:r>
-        <w:t>PR #93 / merge 2ecc4cc643f1933ea7f353ab26aa231bda89e7e6: frontera semántica Gemini Fast para PROMPT_EXFILTRATION, PROMPT_INJECTION, ROLE_ESCALATION y TOOL_MANIPULATION.</w:t>
-      </w:r>
-    </w:p>
-    <w:p>
-      <w:pPr>
-        <w:pStyle w:val="ListBullet"/>
-      </w:pPr>
-      <w:r>
-        <w:t>PR #94 / merge 91b473a475a6fd7c235822c5c930cc0f5eba2002: sideband autenticado, identidad trusted, eventKey SHA-256 opaco, entrega durable directa o Queue e integración con record_caller_security_signal_v2.</w:t>
-      </w:r>
-    </w:p>
-    <w:p>
-      <w:pPr>
-        <w:pStyle w:val="ListBullet"/>
-      </w:pPr>
-      <w:r>
-        <w:t>Política conservadora Gemini: severity=MEDIUM, riskDelta=1, highConfidence=false; suma riesgo pero no strike, no termina la llamada y no bloquea por sí sola.</w:t>
-      </w:r>
-    </w:p>
-    <w:p>
-      <w:pPr>
-        <w:pStyle w:val="ListBullet"/>
-      </w:pPr>
-      <w:r>
-        <w:t>Privacidad: no transcript, audio, prompt, tool payload, callControlId ni toolCallId en caller_security_events; raw_transcript_stored=false.</w:t>
-      </w:r>
-    </w:p>
-    <w:p>
-      <w:pPr>
-        <w:pStyle w:val="ListBullet"/>
-      </w:pPr>
-      <w:r>
-        <w:t>Incidente operativo histórico: la persistencia falló inicialmente por drift del token entre Cloud Run/Fast Worker y Control Plane. Los commits 9eef2567... y 154fdcfd... corrigieron el baseline. El corte Gemini-native quedó desplegado en canary con el SHA d7435fd81915...: el Gemini Fast Worker posee endpoint, adaptador Supabase y Queue/DLQ, confirma Queue antes de responder, usa Supabase directo como fallback y elimina del CI Fast toda escritura o preflight contra el Worker histórico.</w:t>
-      </w:r>
-    </w:p>
-    <w:p>
-      <w:pPr>
-        <w:pStyle w:val="ListBullet"/>
-      </w:pPr>
-      <w:r>
-        <w:t>E2E A-G: cuatro eventos únicos persistidos en 40-135 ms, ningún TOOL_EXECUTION_FAILED; transferencia contestada y cierre HUMAN_HANDOFF_TERMINAL.</w:t>
-      </w:r>
-    </w:p>
-    <w:p>
-      <w:pPr>
-        <w:pStyle w:val="ListBullet"/>
-      </w:pPr>
-      <w:r>
-        <w:t>Continuidad de identidad: CALLER_SECURITY_HMAC_SECRET contiene exactamente los bytes de la clave histórica. CI comparó su SHA-256 con caller-security-hmac-sha256, una huella capturada independientemente antes de la migración. No se generó una clave nueva ni se reutilizó automáticamente la credencial Supabase, evitando dividir el historial de reputación. La persistencia sigue siendo sideband por evento discreto y no añade trabajo al audio por chunk.</w:t>
-      </w:r>
-    </w:p>
-    <w:p>
-      <w:pPr>
-        <w:pStyle w:val="Heading2"/>
-      </w:pPr>
-      <w:r>
-        <w:t>6.9 Aislamiento tenant/capability - SEC-P0-05</w:t>
-      </w:r>
-    </w:p>
-    <w:p>
-      <w:pPr/>
-      <w:r>
-        <w:t>Implementado y verificado localmente el 29 de agosto de 2026, pendiente de commit, CI y despliegue. El bootstrap autenticado evoluciona a gemini-fast-bootstrap.v2 y convierte la capability de cada tool en una concesión explícita, no en metadata implícita por nombre.</w:t>
-      </w:r>
-    </w:p>
-    <w:p>
-      <w:pPr>
-        <w:pStyle w:val="ListBullet"/>
-      </w:pPr>
-      <w:r>
-        <w:t>Control Plane exige nombre y capability válidos, sin duplicados, y conserva ambos en el bootstrap autenticado ligado a credencial, tenant y llamada.</w:t>
-      </w:r>
-    </w:p>
-    <w:p>
-      <w:pPr>
-        <w:pStyle w:val="ListBullet"/>
-      </w:pPr>
-      <w:r>
-        <w:t>Media Edge rechaza bootstrap v1, capability ausente y cualquier diferencia entre la concesión declarada y la policy local antes de construir la sesión o registrar handlers.</w:t>
-      </w:r>
-    </w:p>
-    <w:p>
-      <w:pPr>
-        <w:pStyle w:val="ListBullet"/>
-      </w:pPr>
-      <w:r>
-        <w:t>La capability interna se valida durante bootstrap/setup y se elimina de la declaración enviada al wire de Gemini; no añade RPC, inferencia, persistencia ni trabajo por chunk de audio.</w:t>
-      </w:r>
-    </w:p>
-    <w:p>
-      <w:pPr>
-        <w:pStyle w:val="ListBullet"/>
-      </w:pPr>
-      <w:r>
-        <w:t>El registro de bootstrap consume una sola vez la credencial y rechaza claims de otro tenant/call. El Worker también rechaza tenant_capabilities cuyo tenant declarado no coincide con el tenant resuelto por routing.</w:t>
-      </w:r>
-    </w:p>
-    <w:p>
-      <w:pPr>
-        <w:pStyle w:val="ListBullet"/>
-      </w:pPr>
-      <w:r>
-        <w:t>Reproducción previa: una tool declarada con capability ajena alcanzó el handler (effects=1). Verificación posterior: effects=0 y error Fast tool capability mismatch for declared tool: create_reservation.</w:t>
-      </w:r>
-    </w:p>
-    <w:p>
-      <w:pPr>
-        <w:pStyle w:val="ListBullet"/>
-      </w:pPr>
-      <w:r>
-        <w:t>Validación local: Gemini Media Edge 239/239 tests PASS; Gemini Control Plane 125/125 tests PASS; typecheck PASS; Wrangler dry-run PASS.</w:t>
-      </w:r>
-    </w:p>
-    <w:p>
-      <w:pPr>
         <w:spacing w:after="40"/>
       </w:pPr>
       <w:r>
@@ -623,59 +492,6 @@
       </w:pPr>
       <w:r>
         <w:t>8. Arquitectura objetivo de seguridad</w:t>
-      </w:r>
-    </w:p>
-    <w:p>
-      <w:pPr>
-        <w:pStyle w:val="Heading2"/>
-      </w:pPr>
-      <w:r>
-        <w:t>8.2 Capacidades transversales, verticales y contrato de tools</w:t>
-      </w:r>
-    </w:p>
-    <w:p>
-      <w:r>
-        <w:t>El producto distingue capacidades transversales del kernel y capacidades verticales del tenant. La separación es funcional y de autoridad: una vertical consume capacidades horizontales mediante contratos; no duplica ni puede debilitar sus controles.</w:t>
-      </w:r>
-    </w:p>
-    <w:p>
-      <w:pPr>
-        <w:pStyle w:val="ListBullet"/>
-      </w:pPr>
-      <w:r>
-        <w:t>TRANSVERSALES: admission e identidad Telnyx, caller security/reputación, flujo y lifecycle de voz, autorización de tools, human handoff, autoridad temporal, diagnóstico/redacción y comunicaciones externas.</w:t>
-      </w:r>
-    </w:p>
-    <w:p>
-      <w:pPr>
-        <w:pStyle w:val="ListBullet"/>
-      </w:pPr>
-      <w:r>
-        <w:t>WHATSAPP TRANSVERSAL: el KV de capacidades distingue message.whatsapp.transactional y message.whatsapp.realtime_support. Cada modalidad permanece deshabilitada salvo capacidad explícita del tenant y debe pasar por policy y handler autorizados.</w:t>
-      </w:r>
-    </w:p>
-    <w:p>
-      <w:pPr>
-        <w:pStyle w:val="ListBullet"/>
-      </w:pPr>
-      <w:r>
-        <w:t>VERTICALES: reservas, disponibilidad, horarios, mesas y demás reglas propias del negocio/tenant. Sus datos, schemas e invariantes viven en dominio/backend y no dentro del kernel horizontal.</w:t>
-      </w:r>
-    </w:p>
-    <w:p>
-      <w:pPr>
-        <w:pStyle w:val="ListBullet"/>
-      </w:pPr>
-      <w:r>
-        <w:t>CONTRATO DE TOOL: nombre y schema cerrados; authority; effect; capability; evidence; handler permitido; tenant/call context; idempotencia; y, cuando aplique, confirmación y business invariants.</w:t>
-      </w:r>
-    </w:p>
-    <w:p>
-      <w:pPr>
-        <w:pStyle w:val="ListBullet"/>
-      </w:pPr>
-      <w:r>
-        <w:t>INVARIANTE: Gemini interpreta y propone. FastToolAuthorizationKernel decide ALLOW/DENY. El domain kernel valida la vertical. Supabase/backend es la fuente de verdad y ejecuta el efecto.</w:t>
       </w:r>
     </w:p>
     <w:p>
@@ -1707,7 +1523,7 @@
           </w:tcPr>
           <w:p>
             <w:r>
-              <w:t>Gemini Fast Canary Deploy run 33252047260 - SUCCESS para d7435fd81915...; revisión gemini-media-edge-00202-coh; Fast Worker 3100c432-69a0-44ea-a59f-fdaaa4458221</w:t>
+              <w:t>SEC-P0-05: Gemini Fast Canary Deploy run 33261676273 - SUCCESS; revisión gemini-media-edge-00205-mub; Fast Worker 318b36d8-a900-4fe9-99ba-64863891883f. SEC-P0-06 sólo local.</w:t>
             </w:r>
           </w:p>
         </w:tc>
@@ -7390,6 +7206,52 @@
         <w:pStyle w:val="Heading2"/>
       </w:pPr>
       <w:r>
+        <w:t>6.7 Seguridad semántica y reputación persistente - PR #93/#94</w:t>
+      </w:r>
+    </w:p>
+    <w:p>
+      <w:pPr/>
+      <w:r>
+        <w:t>SEC-P0-02 y SEC-P0-03 están implementados, fusionados y verificados E2E. report_semantic_security_incident acepta categorías cerradas, cruza FastToolAuthorizationKernel y entrega una señal mínima a CallerSecurityService.</w:t>
+      </w:r>
+    </w:p>
+    <w:p>
+      <w:pPr>
+        <w:pStyle w:val="ListBullet"/>
+      </w:pPr>
+      <w:r>
+        <w:t>PR #93 / merge 2ecc4cc643f1933ea7f353ab26aa231bda89e7e6: frontera semántica Gemini Fast para PROMPT_EXFILTRATION, PROMPT_INJECTION, ROLE_ESCALATION y TOOL_MANIPULATION.</w:t>
+      </w:r>
+    </w:p>
+    <w:p>
+      <w:pPr>
+        <w:pStyle w:val="ListBullet"/>
+      </w:pPr>
+      <w:r>
+        <w:t>PR #94 / merge 91b473a475a6fd7c235822c5c930cc0f5eba2002: sideband autenticado, identidad trusted, eventKey SHA-256 opaco y entrega durable Gemini-native.</w:t>
+      </w:r>
+    </w:p>
+    <w:p>
+      <w:pPr>
+        <w:pStyle w:val="ListBullet"/>
+      </w:pPr>
+      <w:r>
+        <w:t>Privacidad: no transcript, audio, prompt, tool payload, callControlId ni toolCallId en caller_security_events; raw_transcript_stored=false.</w:t>
+      </w:r>
+    </w:p>
+    <w:p>
+      <w:pPr>
+        <w:pStyle w:val="ListBullet"/>
+      </w:pPr>
+      <w:r>
+        <w:t>E2E A-G: cuatro eventos únicos persistidos en 40-135 ms, ningún TOOL_EXECUTION_FAILED; transferencia contestada y cierre HUMAN_HANDOFF_TERMINAL.</w:t>
+      </w:r>
+    </w:p>
+    <w:p>
+      <w:pPr>
+        <w:pStyle w:val="Heading2"/>
+      </w:pPr>
+      <w:r>
         <w:t>6.8 Cobertura universal del Tool Kernel - SEC-P0-04</w:t>
       </w:r>
     </w:p>
@@ -7437,6 +7299,122 @@
       </w:pPr>
       <w:r>
         <w:t>Prueba focalizada: 22/22 PASS. Reproducción previa: llamada directa al ejecutor produjo effects=1. Verificación posterior: effects=0 y error Fast tool authorization receipt is required.</w:t>
+      </w:r>
+    </w:p>
+    <w:p>
+      <w:pPr>
+        <w:pStyle w:val="Heading2"/>
+      </w:pPr>
+      <w:r>
+        <w:t>6.9 Aislamiento tenant/capability - SEC-P0-05</w:t>
+      </w:r>
+    </w:p>
+    <w:p>
+      <w:pPr/>
+      <w:r>
+        <w:t>Publicado en a95a9311b4f9c68d1ad1894c1273b6ccf181a462 y desplegado el 29 de agosto de 2026 mediante Gemini Fast Canary Deploy run 33261676273. El bootstrap autenticado gemini-fast-bootstrap.v2 convierte la capability de cada tool en una concesión explícita y tenant-bound.</w:t>
+      </w:r>
+    </w:p>
+    <w:p>
+      <w:pPr>
+        <w:pStyle w:val="ListBullet"/>
+      </w:pPr>
+      <w:r>
+        <w:t>Control Plane exige nombre y capability válidos, sin duplicados, y conserva ambos en el bootstrap autenticado ligado a credencial, tenant y llamada.</w:t>
+      </w:r>
+    </w:p>
+    <w:p>
+      <w:pPr>
+        <w:pStyle w:val="ListBullet"/>
+      </w:pPr>
+      <w:r>
+        <w:t>Media Edge rechaza capability ausente o distinta de la policy local antes de construir la sesión o registrar handlers.</w:t>
+      </w:r>
+    </w:p>
+    <w:p>
+      <w:pPr>
+        <w:pStyle w:val="ListBullet"/>
+      </w:pPr>
+      <w:r>
+        <w:t>El Worker rechaza un registro tenant_capabilities cuyo tenant declarado no coincide con el tenant resuelto por routing.</w:t>
+      </w:r>
+    </w:p>
+    <w:p>
+      <w:pPr>
+        <w:pStyle w:val="ListBullet"/>
+      </w:pPr>
+      <w:r>
+        <w:t>No añade RPC, inferencia, persistencia ni trabajo por chunk de audio; la capability interna no se envía al wire de Gemini.</w:t>
+      </w:r>
+    </w:p>
+    <w:p>
+      <w:pPr>
+        <w:pStyle w:val="ListBullet"/>
+      </w:pPr>
+      <w:r>
+        <w:t>Canary verificado: Cloud Run gemini-media-edge-00205-mub; Fast Worker 318b36d8-a900-4fe9-99ba-64863891883f; bootstrap/HMAC PASS.</w:t>
+      </w:r>
+    </w:p>
+    <w:p>
+      <w:pPr>
+        <w:pStyle w:val="Heading2"/>
+      </w:pPr>
+      <w:r>
+        <w:t>6.10 Auditoría segura unificada - SEC-P0-06</w:t>
+      </w:r>
+    </w:p>
+    <w:p>
+      <w:pPr/>
+      <w:r>
+        <w:t>Implementado y verificado localmente el 29 de agosto de 2026, pendiente de commit, CI y despliegue. El Gemini Fast Worker aplica una frontera común de persistencia segura en /internal/diagnostics-ingest antes de usar la credencial privilegiada de Supabase.</w:t>
+      </w:r>
+    </w:p>
+    <w:p>
+      <w:pPr>
+        <w:pStyle w:val="ListBullet"/>
+      </w:pPr>
+      <w:r>
+        <w:t>El evento se reconstruye desde un schema top-level cerrado y details se proyecta a una allowlist explícita de códigos, métricas y booleanos bounded.</w:t>
+      </w:r>
+    </w:p>
+    <w:p>
+      <w:pPr>
+        <w:pStyle w:val="ListBullet"/>
+      </w:pPr>
+      <w:r>
+        <w:t>Campos desconocidos como transcript, system_prompt, tokens, teléfonos, provider payloads u objetos anidados se descartan antes de llegar a call_diagnostic_events.</w:t>
+      </w:r>
+    </w:p>
+    <w:p>
+      <w:pPr>
+        <w:pStyle w:val="ListBullet"/>
+      </w:pPr>
+      <w:r>
+        <w:t>Un tipo inválido en una clave permitida falla cerrado con INVALID_DIAGNOSTICS y cero llamadas al sink Supabase.</w:t>
+      </w:r>
+    </w:p>
+    <w:p>
+      <w:pPr>
+        <w:pStyle w:val="ListBullet"/>
+      </w:pPr>
+      <w:r>
+        <w:t>La reproducción previa confirmó que detalles arbitrarios alcanzaban el body REST. Tras el cambio sólo persisten metadatos técnicos permitidos.</w:t>
+      </w:r>
+    </w:p>
+    <w:p>
+      <w:pPr>
+        <w:pStyle w:val="ListBullet"/>
+      </w:pPr>
+      <w:r>
+        <w:t>La frontera es Gemini-native, vive en el Worker y se ejecuta durante el flush sideband posterior; no importa el redactor OpenAI ni toca audio, VAD, codecs, buffers o forwarding por chunk.</w:t>
+      </w:r>
+    </w:p>
+    <w:p>
+      <w:pPr>
+        <w:pStyle w:val="ListBullet"/>
+      </w:pPr>
+      <w:r>
+        <w:t>human_handoff_events mantiene un contrato operacional separado: puede conservar teléfonos estrictamente necesarios para la transferencia, con acceso restringido y enmascarado en revisiones ordinarias; esa excepción no aplica al diagnóstico general.</w:t>
       </w:r>
     </w:p>
     <w:p>
@@ -8801,6 +8779,60 @@
       <w:pPr>
         <w:spacing w:after="0"/>
       </w:pPr>
+    </w:p>
+    <w:p>
+      <w:pPr>
+        <w:pStyle w:val="Heading2"/>
+      </w:pPr>
+      <w:r>
+        <w:t>8.2 Capacidades transversales, verticales y contrato de tools</w:t>
+      </w:r>
+    </w:p>
+    <w:p>
+      <w:pPr/>
+      <w:r>
+        <w:t>El producto distingue capacidades transversales del kernel y capacidades verticales del tenant. Una vertical consume capacidades horizontales mediante contratos; no duplica ni puede debilitar sus controles.</w:t>
+      </w:r>
+    </w:p>
+    <w:p>
+      <w:pPr>
+        <w:pStyle w:val="ListBullet"/>
+      </w:pPr>
+      <w:r>
+        <w:t>TRANSVERSALES: admission e identidad Telnyx, caller security/reputación, flujo y lifecycle de voz, autorización de tools, human handoff, autoridad temporal, diagnóstico/redacción y comunicaciones externas.</w:t>
+      </w:r>
+    </w:p>
+    <w:p>
+      <w:pPr>
+        <w:pStyle w:val="ListBullet"/>
+      </w:pPr>
+      <w:r>
+        <w:t>WHATSAPP TRANSVERSAL: el KV distingue message.whatsapp.transactional y message.whatsapp.realtime_support; ambas modalidades requieren capability explícita del tenant.</w:t>
+      </w:r>
+    </w:p>
+    <w:p>
+      <w:pPr>
+        <w:pStyle w:val="ListBullet"/>
+      </w:pPr>
+      <w:r>
+        <w:t>VERTICALES: reservas, disponibilidad, horarios, mesas y reglas propias del negocio/tenant; sus datos e invariantes viven en dominio/backend.</w:t>
+      </w:r>
+    </w:p>
+    <w:p>
+      <w:pPr>
+        <w:pStyle w:val="ListBullet"/>
+      </w:pPr>
+      <w:r>
+        <w:t>CONTRATO DE TOOL: nombre y schema cerrados; authority; effect; capability; evidence; handler permitido; tenant/call context; idempotencia; y, cuando aplique, confirmación y business invariants.</w:t>
+      </w:r>
+    </w:p>
+    <w:p>
+      <w:pPr>
+        <w:pStyle w:val="ListBullet"/>
+      </w:pPr>
+      <w:r>
+        <w:t>INVARIANTE: Gemini interpreta y propone. FastToolAuthorizationKernel decide ALLOW/DENY. El domain kernel valida la vertical. Supabase/backend ejecuta como fuente de verdad.</w:t>
+      </w:r>
     </w:p>
     <w:p>
       <w:pPr>
@@ -9982,7 +10014,7 @@
           </w:tcPr>
           <w:p>
             <w:r>
-              <w:t>COMMIT/PUSH 1d514b5617a9f10691359ba6eb2493a478324baf; pruebas locales PASS. Pendiente CI/canary y, si procede, E2E.</w:t>
+              <w:t>COMMIT/PUSH 1d514b5617a9f10691359ba6eb2493a478324baf; incluido en el canary 33261676273 mediante el SHA posterior a95a9311...; pruebas locales PASS. E2E telefónico no repetido.</w:t>
             </w:r>
           </w:p>
         </w:tc>
@@ -10072,7 +10104,7 @@
           </w:tcPr>
           <w:p>
             <w:r>
-              <w:t>IMPLEMENTADO LOCALMENTE: todos los casos fallan antes del handler con side effect=0; suites completas y dry-run PASS. Pendiente commit, CI/canary y, si procede, E2E.</w:t>
+              <w:t>COMMIT/PUSH a95a9311b4f9c68d1ad1894c1273b6ccf181a462; canary 33261676273 SUCCESS; bootstrap/HMAC verificados. E2E telefónico no repetido.</w:t>
             </w:r>
           </w:p>
         </w:tc>
@@ -10202,17 +10234,8 @@
             <w:shd w:fill="F4F7FA"/>
           </w:tcPr>
           <w:p>
-            <w:pPr>
-              <w:spacing w:after="0"/>
-            </w:pPr>
-            <w:r/>
-            <w:r>
-              <w:rPr>
-                <w:rFonts w:ascii="Aptos" w:hAnsi="Aptos"/>
-                <w:b w:val="0"/>
-                <w:sz w:val="14"/>
-              </w:rPr>
-              <w:t>No raw transcript/phone/secret/prompt en eventos persistidos.</w:t>
+            <w:r>
+              <w:t>IMPLEMENTADO LOCALMENTE: reproducción de fuga previa; allowlist en sink; transcript/prompt/token/teléfono/payload anidado descartados; tipos inválidos fallan antes de Supabase; tests/typecheck/dry-run PASS. Pendiente commit/CI/deploy.</w:t>
             </w:r>
           </w:p>
         </w:tc>
@@ -12718,7 +12741,7 @@
           </w:tcPr>
           <w:p>
             <w:r>
-              <w:t>IMPLEMENTADA LOCALMENTE; PENDIENTE CI/DEPLOY</w:t>
+              <w:t>PUBLICADA E INCLUIDA EN CANARY; E2E NO REPETIDO</w:t>
             </w:r>
           </w:p>
         </w:tc>
@@ -12761,6 +12784,58 @@
           <w:p>
             <w:r>
               <w:t>Cada tool admitida declara capability en bootstrap v2. Media Edge exige coincidencia exacta con la policy local antes de exponerla o ejecutarla; ausencia, mismatch o claims cross-tenant fallan cerrados.</w:t>
+            </w:r>
+          </w:p>
+        </w:tc>
+        <w:tc>
+          <w:tcPr>
+            <w:tcW w:type="dxa" w:w="2040"/>
+          </w:tcPr>
+          <w:p>
+            <w:r>
+              <w:t>IMPLEMENTADA, PUBLICADA Y VERIFICADA EN CANARY</w:t>
+            </w:r>
+          </w:p>
+        </w:tc>
+      </w:tr>
+      <w:tr>
+        <w:tc>
+          <w:tcPr>
+            <w:tcW w:type="dxa" w:w="2040"/>
+          </w:tcPr>
+          <w:p>
+            <w:r>
+              <w:t>D-016</w:t>
+            </w:r>
+          </w:p>
+        </w:tc>
+        <w:tc>
+          <w:tcPr>
+            <w:tcW w:type="dxa" w:w="2040"/>
+          </w:tcPr>
+          <w:p>
+            <w:r>
+              <w:t>2026-08-29</w:t>
+            </w:r>
+          </w:p>
+        </w:tc>
+        <w:tc>
+          <w:tcPr>
+            <w:tcW w:type="dxa" w:w="2040"/>
+          </w:tcPr>
+          <w:p>
+            <w:r>
+              <w:t>Allowlist obligatoria en el sink de diagnóstico general</w:t>
+            </w:r>
+          </w:p>
+        </w:tc>
+        <w:tc>
+          <w:tcPr>
+            <w:tcW w:type="dxa" w:w="2040"/>
+          </w:tcPr>
+          <w:p>
+            <w:r>
+              <w:t>El backend persiste sólo campos técnicos bounded desde un schema cerrado. Desconocidos se descartan y tipos inválidos fallan cerrados. human_handoff_events conserva un contrato operacional separado.</w:t>
             </w:r>
           </w:p>
         </w:tc>
@@ -14626,7 +14701,7 @@
           </w:tcPr>
           <w:p>
             <w:r>
-              <w:t>PUBLICADO; PENDIENTE CI/DEPLOY</w:t>
+              <w:t>PUBLICADO E INCLUIDO EN CANARY; E2E NO REPETIDO</w:t>
             </w:r>
           </w:p>
         </w:tc>
@@ -14658,7 +14733,49 @@
           </w:tcPr>
           <w:p>
             <w:r>
-              <w:t>gemini-fast-bootstrap.v2 y capability explícita; mismatch/ausencia/cross-tenant producen side effect=0. Media Edge 239/239; Control Plane 125/125; typecheck y Wrangler dry-run PASS.</w:t>
+              <w:t>gemini-fast-bootstrap.v2 y capability explícita; commit a95a9311b4f9c68d1ad1894c1273b6ccf181a462; canary 33261676273; Cloud Run gemini-media-edge-00205-mub; Worker 318b36d8-a900-4fe9-99ba-64863891883f.</w:t>
+            </w:r>
+          </w:p>
+        </w:tc>
+        <w:tc>
+          <w:tcPr>
+            <w:tcW w:type="dxa" w:w="2550"/>
+          </w:tcPr>
+          <w:p>
+            <w:r>
+              <w:t>PUBLICADO Y VERIFICADO EN CANARY</w:t>
+            </w:r>
+          </w:p>
+        </w:tc>
+      </w:tr>
+      <w:tr>
+        <w:tc>
+          <w:tcPr>
+            <w:tcW w:type="dxa" w:w="2550"/>
+          </w:tcPr>
+          <w:p>
+            <w:r>
+              <w:t>E-023</w:t>
+            </w:r>
+          </w:p>
+        </w:tc>
+        <w:tc>
+          <w:tcPr>
+            <w:tcW w:type="dxa" w:w="2550"/>
+          </w:tcPr>
+          <w:p>
+            <w:r>
+              <w:t>Código + reproducción + tests locales</w:t>
+            </w:r>
+          </w:p>
+        </w:tc>
+        <w:tc>
+          <w:tcPr>
+            <w:tcW w:type="dxa" w:w="2550"/>
+          </w:tcPr>
+          <w:p>
+            <w:r>
+              <w:t>fast-diagnostic-safety.ts y fast-diagnostics-ingest.ts: antes el body Supabase conservaba transcript/prompt/token/teléfono/payload arbitrario; después sólo conserva allowlist técnica y rechaza tipos inválidos antes del fetch.</w:t>
             </w:r>
           </w:p>
         </w:tc>
@@ -14780,6 +14897,22 @@
     </w:p>
     <w:p>
       <w:pPr>
+        <w:pStyle w:val="ListBullet"/>
+      </w:pPr>
+      <w:r>
+        <w:t>apps/gemini-control-plane/src/fast-diagnostic-safety.ts</w:t>
+      </w:r>
+    </w:p>
+    <w:p>
+      <w:pPr>
+        <w:pStyle w:val="ListBullet"/>
+      </w:pPr>
+      <w:r>
+        <w:t>apps/gemini-control-plane/src/fast-diagnostics-ingest.ts</w:t>
+      </w:r>
+    </w:p>
+    <w:p>
+      <w:pPr>
         <w:pStyle w:val="Heading1"/>
         <w:keepNext/>
       </w:pPr>
@@ -15128,6 +15261,38 @@
           <w:p>
             <w:r>
               <w:t>SEC-P0-04 publicado en 1d514b... y SEC-P0-05 implementado localmente: bootstrap v2, capability grant explícito y tenant-bound, fail-closed ante ausencia/mismatch/cross-tenant y suites completas verdes.</w:t>
+            </w:r>
+          </w:p>
+        </w:tc>
+      </w:tr>
+      <w:tr>
+        <w:tc>
+          <w:tcPr>
+            <w:tcW w:type="dxa" w:w="3400"/>
+          </w:tcPr>
+          <w:p>
+            <w:r>
+              <w:t>0.7</w:t>
+            </w:r>
+          </w:p>
+        </w:tc>
+        <w:tc>
+          <w:tcPr>
+            <w:tcW w:type="dxa" w:w="3400"/>
+          </w:tcPr>
+          <w:p>
+            <w:r>
+              <w:t>2026-08-29</w:t>
+            </w:r>
+          </w:p>
+        </w:tc>
+        <w:tc>
+          <w:tcPr>
+            <w:tcW w:type="dxa" w:w="3400"/>
+          </w:tcPr>
+          <w:p>
+            <w:r>
+              <w:t>SEC-P0-05 reconciliado con su canary desplegado. SEC-P0-06 implementado localmente: schema cerrado y allowlist en el sink Gemini de diagnósticos, tests negativos de contenido sensible y bypass top-level, sin impacto en el hot path.</w:t>
             </w:r>
           </w:p>
         </w:tc>
@@ -15210,9 +15375,9 @@
           </w:tcPr>
           <w:p>
             <w:r>
-              <w:t>Cierre de versión 0.6</w:t>
+              <w:t>Cierre de versión 0.7</w:t>
               <w:br/>
-              <w:t>SEC-P0-04 está publicado, aún sin deploy/E2E. SEC-P0-05 queda implementado y verificado localmente, pero no se considera publicado ni desplegado hasta registrar commit, CI y canary. Permanecen abiertos SEC-P0-06 en adelante y SEC-P1-05.</w:t>
+              <w:t>SEC-P0-04 y SEC-P0-05 están publicados e incluidos en el canary 33261676273. SEC-P0-06 queda implementado y verificado localmente, sin commit, CI ni deploy. Permanecen abiertos SEC-P1-01 en adelante y SEC-P1-05.</w:t>
             </w:r>
           </w:p>
         </w:tc>

</xml_diff>

<commit_message>
feat(security): govern caller risk lifecycle
</commit_message>
<xml_diff>
--- a/Security/IA_RealTime_CenterCall_Guia_Viva_Seguridad.docx
+++ b/Security/IA_RealTime_CenterCall_Guia_Viva_Seguridad.docx
@@ -93,7 +93,7 @@
           </w:tcPr>
           <w:p>
             <w:r>
-              <w:t>0.7 - SEC-P0-06 implementado localmente</w:t>
+              <w:t>0.8 - SEC-P0-06 desplegado; SEC-P1-02 local</w:t>
             </w:r>
           </w:p>
         </w:tc>
@@ -295,7 +295,7 @@
           </w:tcPr>
           <w:p>
             <w:r>
-              <w:t>d7435fd81915c470f74bce81eb87d8ae7bda1c1f</w:t>
+              <w:t>021d134625758cc9228284fecc4f49599a419182</w:t>
             </w:r>
           </w:p>
         </w:tc>
@@ -341,7 +341,7 @@
           </w:tcPr>
           <w:p>
             <w:r>
-              <w:t>SEC-P0-05: Gemini Fast Canary Deploy run 33261676273 - SUCCESS; Cloud Run gemini-media-edge-00205-mub; Fast Worker 318b36d8-a900-4fe9-99ba-64863891883f. SEC-P0-06 pendiente de commit/CI/deploy; tráfico productivo sin cambios.</w:t>
+              <w:t>SEC-P0-06: Gemini Fast Canary Deploy run 33264338263 - SUCCESS; Cloud Run gemini-media-edge-00206-pid; Fast Worker a62e7fac-598d-4944-8ccb-78971284c326. Sonda post-deploy PASS. SEC-P1-02 permanece local; tráfico productivo sin cambios.</w:t>
             </w:r>
           </w:p>
         </w:tc>
@@ -1366,7 +1366,7 @@
           </w:tcPr>
           <w:p>
             <w:r>
-              <w:t>d7435fd81915c470f74bce81eb87d8ae7bda1c1f</w:t>
+              <w:t>021d134625758cc9228284fecc4f49599a419182</w:t>
             </w:r>
           </w:p>
         </w:tc>
@@ -1523,7 +1523,7 @@
           </w:tcPr>
           <w:p>
             <w:r>
-              <w:t>SEC-P0-05: Gemini Fast Canary Deploy run 33261676273 - SUCCESS; revisión gemini-media-edge-00205-mub; Fast Worker 318b36d8-a900-4fe9-99ba-64863891883f. SEC-P0-06 sólo local.</w:t>
+              <w:t>SEC-P0-06: Gemini Fast Canary Deploy run 33264338263 - SUCCESS; revisión gemini-media-edge-00206-pid; Fast Worker a62e7fac-598d-4944-8ccb-78971284c326. SEC-P1-02 sólo local.</w:t>
             </w:r>
           </w:p>
         </w:tc>
@@ -7366,7 +7366,7 @@
     <w:p>
       <w:pPr/>
       <w:r>
-        <w:t>Implementado y verificado localmente el 29 de agosto de 2026, pendiente de commit, CI y despliegue. El Gemini Fast Worker aplica una frontera común de persistencia segura en /internal/diagnostics-ingest antes de usar la credencial privilegiada de Supabase.</w:t>
+        <w:t>Publicado en 021d134625758cc9228284fecc4f49599a419182 y desplegado el 29 de agosto de 2026 mediante Gemini Fast Canary Deploy run 33264338263. El Gemini Fast Worker aplica una frontera común de persistencia segura en /internal/diagnostics-ingest antes de usar la credencial privilegiada de Supabase.</w:t>
       </w:r>
     </w:p>
     <w:p>
@@ -7415,6 +7415,39 @@
       </w:pPr>
       <w:r>
         <w:t>human_handoff_events mantiene un contrato operacional separado: puede conservar teléfonos estrictamente necesarios para la transferencia, con acceso restringido y enmascarado en revisiones ordinarias; esa excepción no aplica al diagnóstico general.</w:t>
+      </w:r>
+    </w:p>
+    <w:p>
+      <w:pPr>
+        <w:pStyle w:val="Heading2"/>
+      </w:pPr>
+      <w:r>
+        <w:t>6.11 Ciclo de vida de reputación - SEC-P1-02</w:t>
+      </w:r>
+    </w:p>
+    <w:p>
+      <w:r>
+        <w:t>Implementado localmente el 29 de agosto de 2026; pendiente de commit, CI, deploy y aplicación de la migración. risk_score decae un punto por cada 24 horas completas sin nueva evidencia de riesgo. El cálculo ocurre dentro de las RPC existentes y no añade viajes de red ni trabajo de audio.</w:t>
+      </w:r>
+    </w:p>
+    <w:p>
+      <w:r>
+        <w:t>El decay no reduce security_strikes, rate_limit_blocks, blocked_until ni permanent_block. Los bloqueos permanentes exigen remediación humana explícita.</w:t>
+      </w:r>
+    </w:p>
+    <w:p>
+      <w:r>
+        <w:t>admin_reset_caller_security_state_v1 es idempotente y Postgres-admin-only: exige event key, motivo cerrado y hash SHA-256 del operador; registra before/after sin teléfono, transcript, prompt ni secreto.</w:t>
+      </w:r>
+    </w:p>
+    <w:p>
+      <w:r>
+        <w:t>Evidencia: la migración completa pasó un dry-run transaccional real con ROLLBACK. Se verificaron decay 5-&gt;2 tras tres días, preservación de strikes/bloqueos, reset mínimo, replay sin segunda mutación, bloqueo permanente sin decay y ACL negativas para anon/authenticated/service_role.</w:t>
+      </w:r>
+    </w:p>
+    <w:p>
+      <w:r>
+        <w:t>Runbook: docs/runbooks/CALLER_SECURITY_REMEDIATION.md. Producción continúa con score acumulativo hasta que la migración se aplique con autorización explícita.</w:t>
       </w:r>
     </w:p>
     <w:p>
@@ -10235,7 +10268,7 @@
           </w:tcPr>
           <w:p>
             <w:r>
-              <w:t>IMPLEMENTADO LOCALMENTE: reproducción de fuga previa; allowlist en sink; transcript/prompt/token/teléfono/payload anidado descartados; tipos inválidos fallan antes de Supabase; tests/typecheck/dry-run PASS. Pendiente commit/CI/deploy.</w:t>
+              <w:t>COMMIT/PUSH 021d134625758cc9228284fecc4f49599a419182; canary 33264338263 SUCCESS; Cloud Run gemini-media-edge-00206-pid; Worker a62e7fac-598d-4944-8ccb-78971284c326; sonda post-deploy: 201/PERSISTED válido, 400/INVALID_DIAGNOSTICS inválido, sólo tres campos seguros y cero filas inválidas.</w:t>
             </w:r>
           </w:p>
         </w:tc>
@@ -10446,17 +10479,8 @@
             <w:shd w:fill="F4F7FA"/>
           </w:tcPr>
           <w:p>
-            <w:pPr>
-              <w:spacing w:after="0"/>
-            </w:pPr>
-            <w:r/>
-            <w:r>
-              <w:rPr>
-                <w:rFonts w:ascii="Aptos" w:hAnsi="Aptos"/>
-                <w:b w:val="0"/>
-                <w:sz w:val="14"/>
-              </w:rPr>
-              <w:t>Runbook de desbloqueo/falsos positivos</w:t>
+            <w:r>
+              <w:t>Decay de risk_score y runbook de desbloqueo/falsos positivos</w:t>
             </w:r>
           </w:p>
         </w:tc>
@@ -10473,17 +10497,8 @@
             <w:shd w:fill="F4F7FA"/>
           </w:tcPr>
           <w:p>
-            <w:pPr>
-              <w:spacing w:after="0"/>
-            </w:pPr>
-            <w:r/>
-            <w:r>
-              <w:rPr>
-                <w:rFonts w:ascii="Aptos" w:hAnsi="Aptos"/>
-                <w:b w:val="0"/>
-                <w:sz w:val="14"/>
-              </w:rPr>
-              <w:t>Proceso seguro para revisar y remediar bloqueos legítimos.</w:t>
+            <w:r>
+              <w:t>Aplicar decay sin nuevo RTT; permitir reset mínimo sólo a administrador Postgres, con idempotencia, motivo cerrado, actor con hash y audit trail.</w:t>
             </w:r>
           </w:p>
         </w:tc>
@@ -10500,17 +10515,8 @@
             <w:shd w:fill="F4F7FA"/>
           </w:tcPr>
           <w:p>
-            <w:pPr>
-              <w:spacing w:after="0"/>
-            </w:pPr>
-            <w:r/>
-            <w:r>
-              <w:rPr>
-                <w:rFonts w:ascii="Aptos" w:hAnsi="Aptos"/>
-                <w:b w:val="0"/>
-                <w:sz w:val="14"/>
-              </w:rPr>
-              <w:t>Procedimiento, permisos y audit trail.</w:t>
+            <w:r>
+              <w:t>IMPLEMENTADO LOCALMENTE: migración y runbook; dry-run transaccional PASS con ROLLBACK. Pendiente commit/CI/deploy/aplicación y advisors post-migración.</w:t>
             </w:r>
           </w:p>
         </w:tc>
@@ -12845,7 +12851,59 @@
           </w:tcPr>
           <w:p>
             <w:r>
-              <w:t>IMPLEMENTADA LOCALMENTE; PENDIENTE PUBLICACIÓN/DEPLOY</w:t>
+              <w:t>IMPLEMENTADA, PUBLICADA, DESPLEGADA Y VERIFICADA CON SONDA POST-DEPLOY</w:t>
+            </w:r>
+          </w:p>
+        </w:tc>
+      </w:tr>
+      <w:tr>
+        <w:tc>
+          <w:tcPr>
+            <w:tcW w:type="dxa" w:w="2040"/>
+          </w:tcPr>
+          <w:p>
+            <w:r>
+              <w:t>D-017</w:t>
+            </w:r>
+          </w:p>
+        </w:tc>
+        <w:tc>
+          <w:tcPr>
+            <w:tcW w:type="dxa" w:w="2040"/>
+          </w:tcPr>
+          <w:p>
+            <w:r>
+              <w:t>2026-08-29</w:t>
+            </w:r>
+          </w:p>
+        </w:tc>
+        <w:tc>
+          <w:tcPr>
+            <w:tcW w:type="dxa" w:w="2040"/>
+          </w:tcPr>
+          <w:p>
+            <w:r>
+              <w:t>Decay conservador y reset administrativo mínimo</w:t>
+            </w:r>
+          </w:p>
+        </w:tc>
+        <w:tc>
+          <w:tcPr>
+            <w:tcW w:type="dxa" w:w="2040"/>
+          </w:tcPr>
+          <w:p>
+            <w:r>
+              <w:t>risk_score decae un punto por 24 h completas dentro de RPCs existentes. Strikes y bloqueos no decaen. El reset exige Postgres admin, event key, motivo cerrado, actor con hash y auditoría before/after.</w:t>
+            </w:r>
+          </w:p>
+        </w:tc>
+        <w:tc>
+          <w:tcPr>
+            <w:tcW w:type="dxa" w:w="2040"/>
+          </w:tcPr>
+          <w:p>
+            <w:r>
+              <w:t>IMPLEMENTADA LOCALMENTE; PENDIENTE PUBLICACIÓN/APLICACIÓN</w:t>
             </w:r>
           </w:p>
         </w:tc>
@@ -14785,7 +14843,49 @@
           </w:tcPr>
           <w:p>
             <w:r>
-              <w:t>VERIFICADO LOCALMENTE</w:t>
+              <w:t>VERIFICADO EN CANARY Y POST-DEPLOY</w:t>
+            </w:r>
+          </w:p>
+        </w:tc>
+      </w:tr>
+      <w:tr>
+        <w:tc>
+          <w:tcPr>
+            <w:tcW w:type="dxa" w:w="2550"/>
+          </w:tcPr>
+          <w:p>
+            <w:r>
+              <w:t>E-024</w:t>
+            </w:r>
+          </w:p>
+        </w:tc>
+        <w:tc>
+          <w:tcPr>
+            <w:tcW w:type="dxa" w:w="2550"/>
+          </w:tcPr>
+          <w:p>
+            <w:r>
+              <w:t>Supabase + test transaccional</w:t>
+            </w:r>
+          </w:p>
+        </w:tc>
+        <w:tc>
+          <w:tcPr>
+            <w:tcW w:type="dxa" w:w="2550"/>
+          </w:tcPr>
+          <w:p>
+            <w:r>
+              <w:t>20260829200938_caller_security_risk_lifecycle.sql: decay 5-&gt;2, strikes/bloqueos preservados, reset idempotente, permanent block sin decay y ACL admin-only; transacción finalizada con ROLLBACK.</w:t>
+            </w:r>
+          </w:p>
+        </w:tc>
+        <w:tc>
+          <w:tcPr>
+            <w:tcW w:type="dxa" w:w="2550"/>
+          </w:tcPr>
+          <w:p>
+            <w:r>
+              <w:t>VERIFICADO LOCALMENTE; PRODUCCIÓN SIN CAMBIOS</w:t>
             </w:r>
           </w:p>
         </w:tc>
@@ -15297,6 +15397,38 @@
           </w:p>
         </w:tc>
       </w:tr>
+      <w:tr>
+        <w:tc>
+          <w:tcPr>
+            <w:tcW w:type="dxa" w:w="3400"/>
+          </w:tcPr>
+          <w:p>
+            <w:r>
+              <w:t>0.8</w:t>
+            </w:r>
+          </w:p>
+        </w:tc>
+        <w:tc>
+          <w:tcPr>
+            <w:tcW w:type="dxa" w:w="3400"/>
+          </w:tcPr>
+          <w:p>
+            <w:r>
+              <w:t>2026-08-29</w:t>
+            </w:r>
+          </w:p>
+        </w:tc>
+        <w:tc>
+          <w:tcPr>
+            <w:tcW w:type="dxa" w:w="3400"/>
+          </w:tcPr>
+          <w:p>
+            <w:r>
+              <w:t>SEC-P0-06 reconciliado con commit, canary y sonda post-deploy. SEC-P1-02 implementado localmente: decay sin nuevo RTT, reset Postgres-admin-only, auditoría e idempotencia; dry-run con ROLLBACK.</w:t>
+            </w:r>
+          </w:p>
+        </w:tc>
+      </w:tr>
     </w:tbl>
     <w:p>
       <w:pPr>
@@ -15375,9 +15507,9 @@
           </w:tcPr>
           <w:p>
             <w:r>
-              <w:t>Cierre de versión 0.7</w:t>
+              <w:t>Cierre de versión 0.8</w:t>
               <w:br/>
-              <w:t>SEC-P0-04 y SEC-P0-05 están publicados e incluidos en el canary 33261676273. SEC-P0-06 queda implementado y verificado localmente, sin commit, CI ni deploy. Permanecen abiertos SEC-P1-01 en adelante y SEC-P1-05.</w:t>
+              <w:t>SEC-P0-06 está publicado, desplegado y verificado post-deploy. SEC-P1-02 queda implementado y verificado localmente, sin commit, CI, deploy ni migración aplicada. Producción mantiene el score acumulativo hasta autorización explícita. Permanecen abiertos SEC-P1-01, SEC-P1-03/04/05 y la revisión separada de admission caller-security Gemini.</w:t>
             </w:r>
           </w:p>
         </w:tc>

</xml_diff>

<commit_message>
docs(security): record risk lifecycle rollout
</commit_message>
<xml_diff>
--- a/Security/IA_RealTime_CenterCall_Guia_Viva_Seguridad.docx
+++ b/Security/IA_RealTime_CenterCall_Guia_Viva_Seguridad.docx
@@ -93,7 +93,7 @@
           </w:tcPr>
           <w:p>
             <w:r>
-              <w:t>0.8 - SEC-P0-06 desplegado; SEC-P1-02 local</w:t>
+              <w:t>0.9 - SEC-P1-02 aplicado y verificado</w:t>
             </w:r>
           </w:p>
         </w:tc>
@@ -341,7 +341,7 @@
           </w:tcPr>
           <w:p>
             <w:r>
-              <w:t>SEC-P0-06: Gemini Fast Canary Deploy run 33264338263 - SUCCESS; Cloud Run gemini-media-edge-00206-pid; Fast Worker a62e7fac-598d-4944-8ccb-78971284c326. Sonda post-deploy PASS. SEC-P1-02 permanece local; tráfico productivo sin cambios.</w:t>
+              <w:t>SEC-P0-06 mantiene Gemini Fast Canary Deploy run 33264338263 en SUCCESS. SEC-P1-02: commit db210c54b939eee49a2a0159cfa1d528c62b839c, Control Plane CI run 33277134222 en SUCCESS y migración Supabase 20260829215407 aplicada; no hubo redeploy del runtime de voz porque no cambió.</w:t>
             </w:r>
           </w:p>
         </w:tc>
@@ -1523,7 +1523,7 @@
           </w:tcPr>
           <w:p>
             <w:r>
-              <w:t>SEC-P0-06: Gemini Fast Canary Deploy run 33264338263 - SUCCESS; revisión gemini-media-edge-00206-pid; Fast Worker a62e7fac-598d-4944-8ccb-78971284c326. SEC-P1-02 sólo local.</w:t>
+              <w:t>SEC-P0-06: Gemini Fast Canary Deploy run 33264338263 - SUCCESS; revisión gemini-media-edge-00206-pid; Fast Worker a62e7fac-598d-4944-8ccb-78971284c326. SEC-P1-02 aplicado en Supabase como migración 20260829215407; runtime de voz sin cambios.</w:t>
             </w:r>
           </w:p>
         </w:tc>
@@ -7427,7 +7427,7 @@
     </w:p>
     <w:p>
       <w:r>
-        <w:t>Implementado localmente el 29 de agosto de 2026; pendiente de commit, CI, deploy y aplicación de la migración. risk_score decae un punto por cada 24 horas completas sin nueva evidencia de riesgo. El cálculo ocurre dentro de las RPC existentes y no añade viajes de red ni trabajo de audio.</w:t>
+        <w:t>Publicado el 29 de agosto de 2026 en db210c54b939eee49a2a0159cfa1d528c62b839c; Control Plane CI run 33277134222 en SUCCESS y migración productiva caller_security_risk_lifecycle aplicada como versión remota 20260829215407. risk_score decae un punto por cada 24 horas completas sin nueva evidencia; el cálculo permanece dentro de las RPC existentes, sin viajes de red ni trabajo de audio adicionales.</w:t>
       </w:r>
     </w:p>
     <w:p>
@@ -15424,7 +15424,7 @@
           </w:tcPr>
           <w:p>
             <w:r>
-              <w:t>SEC-P0-06 reconciliado con commit, canary y sonda post-deploy. SEC-P1-02 implementado localmente: decay sin nuevo RTT, reset Postgres-admin-only, auditoría e idempotencia; dry-run con ROLLBACK.</w:t>
+              <w:t>SEC-P0-06 reconciliado con commit, canary y sonda post-deploy. SEC-P1-02 publicado y aplicado: decay sin nuevo RTT, reset Postgres-admin-only, auditoría e idempotencia; verificación productiva sintética con ROLLBACK y cero filas residuales.</w:t>
             </w:r>
           </w:p>
         </w:tc>
@@ -15507,9 +15507,9 @@
           </w:tcPr>
           <w:p>
             <w:r>
-              <w:t>Cierre de versión 0.8</w:t>
+              <w:t>Cierre de versión 0.9</w:t>
               <w:br/>
-              <w:t>SEC-P0-06 está publicado, desplegado y verificado post-deploy. SEC-P1-02 queda implementado y verificado localmente, sin commit, CI, deploy ni migración aplicada. Producción mantiene el score acumulativo hasta autorización explícita. Permanecen abiertos SEC-P1-01, SEC-P1-03/04/05 y la revisión separada de admission caller-security Gemini.</w:t>
+              <w:t>SEC-P0-06 está publicado, desplegado y verificado post-deploy. SEC-P1-02 está publicado, con CI verde, aplicado y verificado en producción sin datos residuales ni redeploy del runtime de voz. Permanecen abiertos SEC-P1-01, SEC-P1-03/04/05 y la revisión separada de admission caller-security Gemini.</w:t>
             </w:r>
           </w:p>
         </w:tc>

</xml_diff>

<commit_message>
feat(security): terminate repeated semantic attacks
</commit_message>
<xml_diff>
--- a/Security/IA_RealTime_CenterCall_Guia_Viva_Seguridad.docx
+++ b/Security/IA_RealTime_CenterCall_Guia_Viva_Seguridad.docx
@@ -146,17 +146,8 @@
             <w:vAlign w:val="center"/>
           </w:tcPr>
           <w:p>
-            <w:pPr>
-              <w:spacing w:after="0"/>
-            </w:pPr>
-            <w:r/>
             <w:r>
-              <w:rPr>
-                <w:rFonts w:ascii="Aptos" w:hAnsi="Aptos"/>
-                <w:b w:val="0"/>
-                <w:sz w:val="18"/>
-              </w:rPr>
-              <w:t>30 agosto 2026</w:t>
+              <w:t>31 agosto 2026</w:t>
             </w:r>
           </w:p>
         </w:tc>
@@ -1320,6 +1311,38 @@
           </w:p>
         </w:tc>
       </w:tr>
+      <w:tr>
+        <w:tc>
+          <w:tcPr>
+            <w:tcW w:type="dxa" w:w="3312"/>
+          </w:tcPr>
+          <w:p>
+            <w:r>
+              <w:t>Cierre semántico high-confidence</w:t>
+            </w:r>
+          </w:p>
+        </w:tc>
+        <w:tc>
+          <w:tcPr>
+            <w:tcW w:type="dxa" w:w="3312"/>
+          </w:tcPr>
+          <w:p>
+            <w:r>
+              <w:t>3 observaciones autorizadas y distintas, despedida segura y hangup Worker/Telnyx</w:t>
+            </w:r>
+          </w:p>
+        </w:tc>
+        <w:tc>
+          <w:tcPr>
+            <w:tcW w:type="dxa" w:w="3312"/>
+          </w:tcPr>
+          <w:p>
+            <w:r>
+              <w:t>Implementado local; CI, deploy y E2E pendientes</w:t>
+            </w:r>
+          </w:p>
+        </w:tc>
+      </w:tr>
     </w:tbl>
     <w:p>
       <w:pPr>
@@ -2302,17 +2325,8 @@
             <w:vAlign w:val="center"/>
           </w:tcPr>
           <w:p>
-            <w:pPr>
-              <w:spacing w:after="0"/>
-            </w:pPr>
-            <w:r/>
             <w:r>
-              <w:rPr>
-                <w:rFonts w:ascii="Aptos" w:hAnsi="Aptos"/>
-                <w:b w:val="0"/>
-                <w:sz w:val="18"/>
-              </w:rPr>
-              <w:t>Semantic boundary + señal mínima</w:t>
+              <w:t>Semantic boundary + señal mínima; cierre sólo con alta confianza acumulada</w:t>
             </w:r>
           </w:p>
         </w:tc>
@@ -2807,17 +2821,8 @@
             <w:vAlign w:val="center"/>
           </w:tcPr>
           <w:p>
-            <w:pPr>
-              <w:spacing w:after="0"/>
-            </w:pPr>
-            <w:r/>
             <w:r>
-              <w:rPr>
-                <w:rFonts w:ascii="Aptos" w:hAnsi="Aptos"/>
-                <w:b w:val="0"/>
-                <w:sz w:val="18"/>
-              </w:rPr>
-              <w:t>Cierre ante ataque semántico high-confidence</w:t>
+              <w:t>Desplegar y validar cierre semántico high-confidence</w:t>
             </w:r>
           </w:p>
         </w:tc>
@@ -2827,17 +2832,8 @@
             <w:vAlign w:val="center"/>
           </w:tcPr>
           <w:p>
-            <w:pPr>
-              <w:spacing w:after="0"/>
-            </w:pPr>
-            <w:r/>
             <w:r>
-              <w:rPr>
-                <w:rFonts w:ascii="Aptos" w:hAnsi="Aptos"/>
-                <w:b w:val="0"/>
-                <w:sz w:val="18"/>
-              </w:rPr>
-              <w:t>Política + lifecycle tests + falsos positivos</w:t>
+              <w:t>CI + canary + E2E: 3 observaciones, despedida, hangup y señal HIGH</w:t>
             </w:r>
           </w:p>
         </w:tc>
@@ -3651,6 +3647,28 @@
           </w:p>
         </w:tc>
       </w:tr>
+      <w:tr>
+        <w:tc>
+          <w:tcPr>
+            <w:tcW w:type="dxa" w:w="4968"/>
+          </w:tcPr>
+          <w:p>
+            <w:r>
+              <w:t>Una observación no termina la llamada; 3 toolCallId distintos habilitan cierre</w:t>
+            </w:r>
+          </w:p>
+        </w:tc>
+        <w:tc>
+          <w:tcPr>
+            <w:tcW w:type="dxa" w:w="4968"/>
+          </w:tcPr>
+          <w:p>
+            <w:r>
+              <w:t>Implementado local; no desplegado</w:t>
+            </w:r>
+          </w:p>
+        </w:tc>
+      </w:tr>
     </w:tbl>
     <w:sectPr>
       <w:footerReference w:type="default" r:id="rId9"/>

</xml_diff>

<commit_message>
docs(security): record semantic close deployment
</commit_message>
<xml_diff>
--- a/Security/IA_RealTime_CenterCall_Guia_Viva_Seguridad.docx
+++ b/Security/IA_RealTime_CenterCall_Guia_Viva_Seguridad.docx
@@ -1338,7 +1338,7 @@
           </w:tcPr>
           <w:p>
             <w:r>
-              <w:t>Implementado local; CI, deploy y E2E pendientes</w:t>
+              <w:t>Desplegado; CI y canary PASS; E2E real pendiente</w:t>
             </w:r>
           </w:p>
         </w:tc>
@@ -2822,7 +2822,7 @@
           </w:tcPr>
           <w:p>
             <w:r>
-              <w:t>Desplegar y validar cierre semántico high-confidence</w:t>
+              <w:t>Validar E2E cierre semántico high-confidence</w:t>
             </w:r>
           </w:p>
         </w:tc>
@@ -2833,7 +2833,7 @@
           </w:tcPr>
           <w:p>
             <w:r>
-              <w:t>CI + canary + E2E: 3 observaciones, despedida, hangup y señal HIGH</w:t>
+              <w:t>Llamada real: 3 observaciones, despedida, hangup y señal HIGH</w:t>
             </w:r>
           </w:p>
         </w:tc>
@@ -3664,7 +3664,7 @@
           </w:tcPr>
           <w:p>
             <w:r>
-              <w:t>Implementado local; no desplegado</w:t>
+              <w:t>Desplegado; E2E real pendiente</w:t>
             </w:r>
           </w:p>
         </w:tc>

</xml_diff>